<commit_message>
Diccionario de datos: ejemplo del target, evidencia con etiquetas corregidas y pendientes al día
Co-Authored-By: Claude Sonnet 5.5 <noreply@anthropic.com>
Claude-Session: https://claude.ai/code/session_01Dfvsg3NvYDPejJeA8GF2ST
</commit_message>
<xml_diff>
--- a/docs/Diccionario_de_datos_Modelo_de_alerta_de_huaicos_Chosica.docx
+++ b/docs/Diccionario_de_datos_Modelo_de_alerta_de_huaicos_Chosica.docx
@@ -12,7 +12,7 @@
     </w:p>
     <w:p>
       <w:r>
-        <w:t xml:space="preserve">Oct 11, 2026 · @Camilo · versión 2 (actualizada; la primera es del 5 de octubre)</w:t>
+        <w:t xml:space="preserve">Oct 12, 2026 · @Camilo · versión 2 (actualizada; la primera es del 5 de octubre)</w:t>
       </w:r>
     </w:p>
     <w:p>
@@ -4149,6 +4149,60 @@
           <w:b/>
           <w:bCs/>
         </w:rPr>
+        <w:t xml:space="preserve">Ejemplo real: Quirio, 23/03/2015, huaico a las 15:10, H = 6.</w:t>
+      </w:r>
+      <w:r>
+        <w:t xml:space="preserve"> La fila de la hora </w:t>
+      </w:r>
+      <w:r>
+        <w:rPr>
+          <w:i/>
+          <w:iCs/>
+        </w:rPr>
+        <w:t xml:space="preserve">t</w:t>
+      </w:r>
+      <w:r>
+        <w:t xml:space="preserve"> mira la ventana (t, t + 6 h]. Las filas de las 10:00 a las 15:00 incluyen las 15:10, así que valen 1 (6 filas). Las filas de las 16:00 en adelante quedan vacías porque el huaico ya pasó. Con H = 3 son 3 filas con y = 1 (13:00 a 15:00) y con H = 24 son 24 (desde las 16:00 del día anterior). Ese día además hubo otros eventos sin quebrada ubicada, por eso las filas de las 07:00 a las 09:00 también salen vacías.</w:t>
+      </w:r>
+    </w:p>
+    <w:p>
+      <w:r>
+        <w:rPr>
+          <w:b/>
+          <w:bCs/>
+        </w:rPr>
+        <w:t xml:space="preserve">El target se arma hora por hora, no por bloques.</w:t>
+      </w:r>
+      <w:r>
+        <w:t xml:space="preserve"> Las filas con y = 1 de un mismo huaico quedan seguidas y forman un </w:t>
+      </w:r>
+      <w:r>
+        <w:rPr>
+          <w:i/>
+          <w:iCs/>
+        </w:rPr>
+        <w:t xml:space="preserve">bloque</w:t>
+      </w:r>
+      <w:r>
+        <w:t xml:space="preserve"> de H horas; el modelo nunca ve el bloque, solo filas sueltas. El bloque se usa después para medir: un huaico cuenta como </w:t>
+      </w:r>
+      <w:r>
+        <w:rPr>
+          <w:i/>
+          <w:iCs/>
+        </w:rPr>
+        <w:t xml:space="preserve">detectado</w:t>
+      </w:r>
+      <w:r>
+        <w:t xml:space="preserve"> si hubo al menos una alerta dentro de su bloque.</w:t>
+      </w:r>
+    </w:p>
+    <w:p>
+      <w:r>
+        <w:rPr>
+          <w:b/>
+          <w:bCs/>
+        </w:rPr>
         <w:t xml:space="preserve">Regla del paso 9.2.</w:t>
       </w:r>
       <w:r>
@@ -10439,7 +10493,7 @@
           <w:b/>
           <w:bCs/>
         </w:rPr>
-        <w:t xml:space="preserve">Qué dijo la evidencia (pasos 5 y 6, hecha antes del cambio de etiquetas del paso 9.2, que se está re-corriendo):</w:t>
+        <w:t xml:space="preserve">Qué dijo la evidencia (pasos 5 y 6, con las etiquetas anteriores al paso 9.2):</w:t>
       </w:r>
       <w:r>
         <w:t xml:space="preserve"> el grupo regional ayudó (de ~3.4 a ~6.1 de </w:t>
@@ -10452,7 +10506,7 @@
         <w:t xml:space="preserve">lift</w:t>
       </w:r>
       <w:r>
-        <w:t xml:space="preserve">, confirmado con 3 semillas y 3 tipos de modelo); la humedad previa perjudicó (el modelo se apoya en ella pero no generaliza entre temporadas); las demás no mostraron efecto claro. Ojo: el grupo regional se identificó mirando las mismas 6 temporadas de prueba; falta validarlo con una temporada nueva.</w:t>
+        <w:t xml:space="preserve">, confirmado con 3 semillas y 3 tipos de modelo); la humedad previa perjudicó (el modelo se apoya en ella pero no generaliza entre temporadas); las demás no mostraron efecto claro. Con las etiquetas corregidas solo se repitió el modelo final: agregar el grupo regional a las variables originales sigue sumando (lift 8.9 → 10.9) y lo que más pesa son las restricciones físicas (lift 19.6). Las ablaciones por grupo no se han repetido todavía. Ojo: el grupo regional se identificó mirando las mismas 6 temporadas de prueba; falta validarlo con una temporada nueva.</w:t>
       </w:r>
     </w:p>
     <w:p>
@@ -18920,10 +18974,22 @@
         <w:ind w:left="360" w:hanging="360"/>
       </w:pPr>
       <w:r>
+        <w:t xml:space="preserve">☑  </w:t>
+      </w:r>
+      <w:r>
+        <w:t xml:space="preserve">Re-correr el modelo restringido con las etiquetas corregidas del paso 9.2 (versión rápida)</w:t>
+      </w:r>
+    </w:p>
+    <w:p>
+      <w:pPr>
+        <w:spacing w:after="80"/>
+        <w:ind w:left="360" w:hanging="360"/>
+      </w:pPr>
+      <w:r>
         <w:t xml:space="preserve">☐  </w:t>
       </w:r>
       <w:r>
-        <w:t xml:space="preserve">Re-correr el modelo con las etiquetas corregidas del paso 9.2 (en curso)</w:t>
+        <w:t xml:space="preserve">Re-correr la cadena completa con las etiquetas corregidas: ablaciones de ingeniería, logística y Random Forest, techo sin latencia (~2 h)</w:t>
       </w:r>
     </w:p>
     <w:p>

</xml_diff>